<commit_message>
Move Task Info WBS-23, Task Info WBS-6.1 and Task Info WBS-25 to main branch
</commit_message>
<xml_diff>
--- a/Documentation/Analysis/Task Informations/In Progress/Team/Task Info WBS-25.docx
+++ b/Documentation/Analysis/Task Informations/In Progress/Team/Task Info WBS-25.docx
@@ -572,7 +572,7 @@
                   <w14:miter w14:lim="400000"/>
                 </w14:textOutline>
               </w:rPr>
-              <w:t>In progress</w:t>
+              <w:t>InProgress</w:t>
             </w:r>
           </w:p>
         </w:tc>
@@ -740,37 +740,7 @@
                   <w14:miter w14:lim="400000"/>
                 </w14:textOutline>
               </w:rPr>
-              <w:t xml:space="preserve">Teacher’s notes, </w:t>
-            </w:r>
-            <w:proofErr w:type="spellStart"/>
-            <w:r>
-              <w:rPr>
-                <w:rFonts w:ascii="Calibri" w:hAnsi="Calibri" w:cs="Arial Unicode MS"/>
-                <w:color w:val="000000"/>
-                <w:sz w:val="36"/>
-                <w:szCs w:val="36"/>
-                <w14:textOutline w14:w="12700" w14:cap="flat" w14:cmpd="sng" w14:algn="ctr">
-                  <w14:noFill/>
-                  <w14:prstDash w14:val="solid"/>
-                  <w14:miter w14:lim="400000"/>
-                </w14:textOutline>
-              </w:rPr>
-              <w:t>Sparx</w:t>
-            </w:r>
-            <w:proofErr w:type="spellEnd"/>
-            <w:r>
-              <w:rPr>
-                <w:rFonts w:ascii="Calibri" w:hAnsi="Calibri" w:cs="Arial Unicode MS"/>
-                <w:color w:val="000000"/>
-                <w:sz w:val="36"/>
-                <w:szCs w:val="36"/>
-                <w14:textOutline w14:w="12700" w14:cap="flat" w14:cmpd="sng" w14:algn="ctr">
-                  <w14:noFill/>
-                  <w14:prstDash w14:val="solid"/>
-                  <w14:miter w14:lim="400000"/>
-                </w14:textOutline>
-              </w:rPr>
-              <w:t xml:space="preserve"> Enterprise Architect</w:t>
+              <w:t>Teacher’s notes, Sparx Enterprise Architect</w:t>
             </w:r>
           </w:p>
         </w:tc>
@@ -921,7 +891,11 @@
               <w:right w:w="0" w:type="dxa"/>
             </w:tcMar>
           </w:tcPr>
-          <w:p/>
+          <w:p>
+            <w:r>
+              <w:t>45 minutes until now</w:t>
+            </w:r>
+          </w:p>
         </w:tc>
       </w:tr>
       <w:tr>
@@ -1192,7 +1166,6 @@
           <w:rFonts w:ascii="Mj_Casablanca" w:eastAsia="Mj_Casablanca" w:hAnsi="Mj_Casablanca" w:cs="Mj_Casablanca" w:hint="default"/>
         </w:rPr>
       </w:pPr>
-      <w:proofErr w:type="spellStart"/>
       <w:r>
         <w:rPr>
           <w:rFonts w:cs="Mj_Casablanca"/>
@@ -1200,7 +1173,6 @@
         </w:rPr>
         <w:t>توضیحات</w:t>
       </w:r>
-      <w:proofErr w:type="spellEnd"/>
       <w:r>
         <w:rPr>
           <w:rFonts w:ascii="Mj_Casablanca" w:hAnsi="Mj_Casablanca"/>
@@ -1222,37 +1194,12 @@
           <w:rtl/>
         </w:rPr>
       </w:pPr>
-      <w:proofErr w:type="spellStart"/>
       <w:r>
         <w:rPr>
           <w:rFonts w:ascii="Arial Unicode MS" w:hAnsi="Arial Unicode MS" w:cs="Mj_Casablanca Light" w:hint="cs"/>
           <w:rtl/>
         </w:rPr>
-        <w:t>برای</w:t>
-      </w:r>
-      <w:proofErr w:type="spellEnd"/>
-      <w:r>
-        <w:rPr>
-          <w:rFonts w:ascii="Arial Unicode MS" w:hAnsi="Arial Unicode MS" w:cs="Mj_Casablanca Light" w:hint="cs"/>
-          <w:rtl/>
-        </w:rPr>
-        <w:t xml:space="preserve"> هر </w:t>
-      </w:r>
-      <w:proofErr w:type="spellStart"/>
-      <w:r>
-        <w:rPr>
-          <w:rFonts w:ascii="Arial Unicode MS" w:hAnsi="Arial Unicode MS" w:cs="Mj_Casablanca Light" w:hint="cs"/>
-          <w:rtl/>
-        </w:rPr>
-        <w:t>تسک</w:t>
-      </w:r>
-      <w:proofErr w:type="spellEnd"/>
-      <w:r>
-        <w:rPr>
-          <w:rFonts w:ascii="Arial Unicode MS" w:hAnsi="Arial Unicode MS" w:cs="Mj_Casablanca Light" w:hint="cs"/>
-          <w:rtl/>
-        </w:rPr>
-        <w:t xml:space="preserve"> در </w:t>
+        <w:t xml:space="preserve">برای هر تسک در </w:t>
       </w:r>
       <w:r>
         <w:rPr>
@@ -1266,35 +1213,22 @@
         </w:rPr>
         <w:t xml:space="preserve"> </w:t>
       </w:r>
-      <w:proofErr w:type="spellStart"/>
       <w:r>
         <w:rPr>
           <w:rFonts w:ascii="Arial Unicode MS" w:hAnsi="Arial Unicode MS" w:cs="Mj_Casablanca Light" w:hint="cs"/>
           <w:rtl/>
         </w:rPr>
-        <w:t>براساس</w:t>
+        <w:t xml:space="preserve">براساس شماره آن، یک </w:t>
       </w:r>
-      <w:proofErr w:type="spellEnd"/>
       <w:r>
         <w:rPr>
-          <w:rFonts w:ascii="Arial Unicode MS" w:hAnsi="Arial Unicode MS" w:cs="Mj_Casablanca Light" w:hint="cs"/>
-          <w:rtl/>
-        </w:rPr>
-        <w:t xml:space="preserve"> شماره آن، </w:t>
+          <w:rFonts w:ascii="Arial Unicode MS" w:hAnsi="Arial Unicode MS"/>
+        </w:rPr>
+        <w:t>Task</w:t>
       </w:r>
-      <w:proofErr w:type="spellStart"/>
       <w:r>
         <w:rPr>
-          <w:rFonts w:ascii="Arial Unicode MS" w:hAnsi="Arial Unicode MS" w:cs="Mj_Casablanca Light" w:hint="cs"/>
-          <w:rtl/>
-        </w:rPr>
-        <w:t>یک</w:t>
-      </w:r>
-      <w:proofErr w:type="spellEnd"/>
-      <w:r>
-        <w:rPr>
-          <w:rFonts w:ascii="Arial Unicode MS" w:hAnsi="Arial Unicode MS" w:cs="Mj_Casablanca Light" w:hint="cs"/>
-          <w:rtl/>
+          <w:rFonts w:ascii="Mj_Casablanca Light" w:hAnsi="Mj_Casablanca Light"/>
         </w:rPr>
         <w:t xml:space="preserve"> </w:t>
       </w:r>
@@ -1302,18 +1236,6 @@
         <w:rPr>
           <w:rFonts w:ascii="Arial Unicode MS" w:hAnsi="Arial Unicode MS"/>
         </w:rPr>
-        <w:t>Task</w:t>
-      </w:r>
-      <w:r>
-        <w:rPr>
-          <w:rFonts w:ascii="Mj_Casablanca Light" w:hAnsi="Mj_Casablanca Light"/>
-        </w:rPr>
-        <w:t xml:space="preserve"> </w:t>
-      </w:r>
-      <w:r>
-        <w:rPr>
-          <w:rFonts w:ascii="Arial Unicode MS" w:hAnsi="Arial Unicode MS"/>
-        </w:rPr>
         <w:t>Information</w:t>
       </w:r>
       <w:r>
@@ -1321,97 +1243,8 @@
           <w:rFonts w:ascii="Arial Unicode MS" w:hAnsi="Arial Unicode MS" w:cs="Mj_Casablanca Light" w:hint="cs"/>
           <w:rtl/>
         </w:rPr>
-        <w:t xml:space="preserve"> </w:t>
+        <w:t xml:space="preserve"> میسازیم تا هم در داکیومنت ها قرار بدیم، هم مدیریت بهتری داشته باشیم</w:t>
       </w:r>
-      <w:proofErr w:type="spellStart"/>
-      <w:r>
-        <w:rPr>
-          <w:rFonts w:ascii="Arial Unicode MS" w:hAnsi="Arial Unicode MS" w:cs="Mj_Casablanca Light" w:hint="cs"/>
-          <w:rtl/>
-        </w:rPr>
-        <w:t>میسازیم</w:t>
-      </w:r>
-      <w:proofErr w:type="spellEnd"/>
-      <w:r>
-        <w:rPr>
-          <w:rFonts w:ascii="Arial Unicode MS" w:hAnsi="Arial Unicode MS" w:cs="Mj_Casablanca Light" w:hint="cs"/>
-          <w:rtl/>
-        </w:rPr>
-        <w:t xml:space="preserve"> تا هم در </w:t>
-      </w:r>
-      <w:proofErr w:type="spellStart"/>
-      <w:r>
-        <w:rPr>
-          <w:rFonts w:ascii="Arial Unicode MS" w:hAnsi="Arial Unicode MS" w:cs="Mj_Casablanca Light" w:hint="cs"/>
-          <w:rtl/>
-        </w:rPr>
-        <w:t>داکیومنت</w:t>
-      </w:r>
-      <w:proofErr w:type="spellEnd"/>
-      <w:r>
-        <w:rPr>
-          <w:rFonts w:ascii="Arial Unicode MS" w:hAnsi="Arial Unicode MS" w:cs="Mj_Casablanca Light" w:hint="cs"/>
-          <w:rtl/>
-        </w:rPr>
-        <w:t xml:space="preserve"> ها قرار </w:t>
-      </w:r>
-      <w:proofErr w:type="spellStart"/>
-      <w:r>
-        <w:rPr>
-          <w:rFonts w:ascii="Arial Unicode MS" w:hAnsi="Arial Unicode MS" w:cs="Mj_Casablanca Light" w:hint="cs"/>
-          <w:rtl/>
-        </w:rPr>
-        <w:t>بدیم</w:t>
-      </w:r>
-      <w:proofErr w:type="spellEnd"/>
-      <w:r>
-        <w:rPr>
-          <w:rFonts w:ascii="Arial Unicode MS" w:hAnsi="Arial Unicode MS" w:cs="Mj_Casablanca Light" w:hint="cs"/>
-          <w:rtl/>
-        </w:rPr>
-        <w:t xml:space="preserve">، هم </w:t>
-      </w:r>
-      <w:proofErr w:type="spellStart"/>
-      <w:r>
-        <w:rPr>
-          <w:rFonts w:ascii="Arial Unicode MS" w:hAnsi="Arial Unicode MS" w:cs="Mj_Casablanca Light" w:hint="cs"/>
-          <w:rtl/>
-        </w:rPr>
-        <w:t>مدیریت</w:t>
-      </w:r>
-      <w:proofErr w:type="spellEnd"/>
-      <w:r>
-        <w:rPr>
-          <w:rFonts w:ascii="Arial Unicode MS" w:hAnsi="Arial Unicode MS" w:cs="Mj_Casablanca Light" w:hint="cs"/>
-          <w:rtl/>
-        </w:rPr>
-        <w:t xml:space="preserve"> </w:t>
-      </w:r>
-      <w:proofErr w:type="spellStart"/>
-      <w:r>
-        <w:rPr>
-          <w:rFonts w:ascii="Arial Unicode MS" w:hAnsi="Arial Unicode MS" w:cs="Mj_Casablanca Light" w:hint="cs"/>
-          <w:rtl/>
-        </w:rPr>
-        <w:t>بهتری</w:t>
-      </w:r>
-      <w:proofErr w:type="spellEnd"/>
-      <w:r>
-        <w:rPr>
-          <w:rFonts w:ascii="Arial Unicode MS" w:hAnsi="Arial Unicode MS" w:cs="Mj_Casablanca Light" w:hint="cs"/>
-          <w:rtl/>
-        </w:rPr>
-        <w:t xml:space="preserve"> داشته </w:t>
-      </w:r>
-      <w:proofErr w:type="spellStart"/>
-      <w:r>
-        <w:rPr>
-          <w:rFonts w:ascii="Arial Unicode MS" w:hAnsi="Arial Unicode MS" w:cs="Mj_Casablanca Light" w:hint="cs"/>
-          <w:rtl/>
-        </w:rPr>
-        <w:t>باشیم</w:t>
-      </w:r>
-      <w:proofErr w:type="spellEnd"/>
       <w:r>
         <w:rPr>
           <w:rFonts w:ascii="Mj_Casablanca Light" w:hAnsi="Mj_Casablanca Light"/>
@@ -1438,58 +1271,22 @@
           <w:u w:color="EE0000"/>
           <w:rtl/>
         </w:rPr>
-        <w:t xml:space="preserve">مثال </w:t>
+        <w:t xml:space="preserve">مثال تکمیل شده در صفحه </w:t>
       </w:r>
-      <w:proofErr w:type="spellStart"/>
+      <w:r>
+        <w:rPr>
+          <w:rFonts w:ascii="Mj_Casablanca Light" w:hAnsi="Mj_Casablanca Light"/>
+          <w:u w:color="EE0000"/>
+        </w:rPr>
+        <w:t xml:space="preserve">23 </w:t>
+      </w:r>
       <w:r>
         <w:rPr>
           <w:rFonts w:ascii="Arial Unicode MS" w:hAnsi="Arial Unicode MS" w:cs="Mj_Casablanca Light" w:hint="cs"/>
           <w:u w:color="EE0000"/>
           <w:rtl/>
         </w:rPr>
-        <w:t>تکمیل</w:t>
-      </w:r>
-      <w:proofErr w:type="spellEnd"/>
-      <w:r>
-        <w:rPr>
-          <w:rFonts w:ascii="Arial Unicode MS" w:hAnsi="Arial Unicode MS" w:cs="Mj_Casablanca Light" w:hint="cs"/>
-          <w:u w:color="EE0000"/>
-          <w:rtl/>
-        </w:rPr>
-        <w:t xml:space="preserve"> شده در صفحه </w:t>
-      </w:r>
-      <w:r>
-        <w:rPr>
-          <w:rFonts w:ascii="Mj_Casablanca Light" w:hAnsi="Mj_Casablanca Light"/>
-          <w:u w:color="EE0000"/>
-        </w:rPr>
-        <w:t xml:space="preserve">23 </w:t>
-      </w:r>
-      <w:r>
-        <w:rPr>
-          <w:rFonts w:ascii="Arial Unicode MS" w:hAnsi="Arial Unicode MS" w:cs="Mj_Casablanca Light" w:hint="cs"/>
-          <w:u w:color="EE0000"/>
-          <w:rtl/>
-        </w:rPr>
-        <w:t xml:space="preserve">فصل ۲ </w:t>
-      </w:r>
-      <w:proofErr w:type="spellStart"/>
-      <w:r>
-        <w:rPr>
-          <w:rFonts w:ascii="Arial Unicode MS" w:hAnsi="Arial Unicode MS" w:cs="Mj_Casablanca Light" w:hint="cs"/>
-          <w:u w:color="EE0000"/>
-          <w:rtl/>
-        </w:rPr>
-        <w:t>آمده</w:t>
-      </w:r>
-      <w:proofErr w:type="spellEnd"/>
-      <w:r>
-        <w:rPr>
-          <w:rFonts w:ascii="Arial Unicode MS" w:hAnsi="Arial Unicode MS" w:cs="Mj_Casablanca Light" w:hint="cs"/>
-          <w:u w:color="EE0000"/>
-          <w:rtl/>
-        </w:rPr>
-        <w:t xml:space="preserve"> است</w:t>
+        <w:t>فصل ۲ آمده است</w:t>
       </w:r>
       <w:r>
         <w:rPr>
@@ -1513,92 +1310,36 @@
           <w:rtl/>
         </w:rPr>
       </w:pPr>
-      <w:proofErr w:type="spellStart"/>
       <w:r>
         <w:rPr>
           <w:rFonts w:ascii="Arial Unicode MS" w:hAnsi="Arial Unicode MS" w:cs="Mj_Casablanca Light" w:hint="cs"/>
           <w:u w:color="EE0000"/>
           <w:rtl/>
         </w:rPr>
-        <w:t>تخمین</w:t>
+        <w:t xml:space="preserve">تخمین زمان ها با فرمول </w:t>
       </w:r>
-      <w:proofErr w:type="spellEnd"/>
+      <w:r>
+        <w:rPr>
+          <w:rFonts w:ascii="Arial Unicode MS" w:hAnsi="Arial Unicode MS"/>
+          <w:u w:color="EE0000"/>
+        </w:rPr>
+        <w:t>PERT</w:t>
+      </w:r>
+      <w:r>
+        <w:rPr>
+          <w:rFonts w:ascii="Mj_Casablanca Light" w:hAnsi="Mj_Casablanca Light"/>
+          <w:u w:color="EE0000"/>
+        </w:rPr>
+        <w:t xml:space="preserve"> </w:t>
+      </w:r>
       <w:r>
         <w:rPr>
           <w:rFonts w:ascii="Arial Unicode MS" w:hAnsi="Arial Unicode MS" w:cs="Mj_Casablanca Light" w:hint="cs"/>
           <w:u w:color="EE0000"/>
           <w:rtl/>
         </w:rPr>
-        <w:t xml:space="preserve"> زمان ها </w:t>
+        <w:t>انجام میشود</w:t>
       </w:r>
-      <w:proofErr w:type="spellStart"/>
-      <w:r>
-        <w:rPr>
-          <w:rFonts w:ascii="Arial Unicode MS" w:hAnsi="Arial Unicode MS" w:cs="Mj_Casablanca Light" w:hint="cs"/>
-          <w:u w:color="EE0000"/>
-          <w:rtl/>
-        </w:rPr>
-        <w:t>با</w:t>
-      </w:r>
-      <w:proofErr w:type="spellEnd"/>
-      <w:r>
-        <w:rPr>
-          <w:rFonts w:ascii="Arial Unicode MS" w:hAnsi="Arial Unicode MS" w:cs="Mj_Casablanca Light" w:hint="cs"/>
-          <w:u w:color="EE0000"/>
-          <w:rtl/>
-        </w:rPr>
-        <w:t xml:space="preserve"> </w:t>
-      </w:r>
-      <w:proofErr w:type="spellStart"/>
-      <w:r>
-        <w:rPr>
-          <w:rFonts w:ascii="Arial Unicode MS" w:hAnsi="Arial Unicode MS" w:cs="Mj_Casablanca Light" w:hint="cs"/>
-          <w:u w:color="EE0000"/>
-          <w:rtl/>
-        </w:rPr>
-        <w:t>فرمول</w:t>
-      </w:r>
-      <w:proofErr w:type="spellEnd"/>
-      <w:r>
-        <w:rPr>
-          <w:rFonts w:ascii="Arial Unicode MS" w:hAnsi="Arial Unicode MS" w:cs="Mj_Casablanca Light" w:hint="cs"/>
-          <w:u w:color="EE0000"/>
-          <w:rtl/>
-        </w:rPr>
-        <w:t xml:space="preserve"> </w:t>
-      </w:r>
-      <w:r>
-        <w:rPr>
-          <w:rFonts w:ascii="Arial Unicode MS" w:hAnsi="Arial Unicode MS"/>
-          <w:u w:color="EE0000"/>
-        </w:rPr>
-        <w:t>PERT</w:t>
-      </w:r>
-      <w:r>
-        <w:rPr>
-          <w:rFonts w:ascii="Mj_Casablanca Light" w:hAnsi="Mj_Casablanca Light"/>
-          <w:u w:color="EE0000"/>
-        </w:rPr>
-        <w:t xml:space="preserve"> </w:t>
-      </w:r>
-      <w:r>
-        <w:rPr>
-          <w:rFonts w:ascii="Arial Unicode MS" w:hAnsi="Arial Unicode MS" w:cs="Mj_Casablanca Light" w:hint="cs"/>
-          <w:u w:color="EE0000"/>
-          <w:rtl/>
-        </w:rPr>
-        <w:t xml:space="preserve">انجام </w:t>
-      </w:r>
-      <w:proofErr w:type="spellStart"/>
-      <w:r>
-        <w:rPr>
-          <w:rFonts w:ascii="Arial Unicode MS" w:hAnsi="Arial Unicode MS" w:cs="Mj_Casablanca Light" w:hint="cs"/>
-          <w:u w:color="EE0000"/>
-          <w:rtl/>
-        </w:rPr>
-        <w:t>میشود</w:t>
-      </w:r>
-      <w:proofErr w:type="spellEnd"/>
       <w:r>
         <w:rPr>
           <w:rFonts w:ascii="Mj_Casablanca Light" w:hAnsi="Mj_Casablanca Light"/>
@@ -1621,95 +1362,13 @@
           <w:rtl/>
         </w:rPr>
       </w:pPr>
-      <w:proofErr w:type="spellStart"/>
       <w:r>
         <w:rPr>
           <w:rFonts w:ascii="Arial Unicode MS" w:hAnsi="Arial Unicode MS" w:cs="Mj_Casablanca Light" w:hint="cs"/>
           <w:u w:color="EE0000"/>
           <w:rtl/>
         </w:rPr>
-        <w:t>ترتیب</w:t>
-      </w:r>
-      <w:proofErr w:type="spellEnd"/>
-      <w:r>
-        <w:rPr>
-          <w:rFonts w:ascii="Arial Unicode MS" w:hAnsi="Arial Unicode MS" w:cs="Mj_Casablanca Light" w:hint="cs"/>
-          <w:u w:color="EE0000"/>
-          <w:rtl/>
-        </w:rPr>
-        <w:t xml:space="preserve"> </w:t>
-      </w:r>
-      <w:proofErr w:type="spellStart"/>
-      <w:r>
-        <w:rPr>
-          <w:rFonts w:ascii="Arial Unicode MS" w:hAnsi="Arial Unicode MS" w:cs="Mj_Casablanca Light" w:hint="cs"/>
-          <w:u w:color="EE0000"/>
-          <w:rtl/>
-        </w:rPr>
-        <w:t>اولویت</w:t>
-      </w:r>
-      <w:proofErr w:type="spellEnd"/>
-      <w:r>
-        <w:rPr>
-          <w:rFonts w:ascii="Arial Unicode MS" w:hAnsi="Arial Unicode MS" w:cs="Mj_Casablanca Light" w:hint="cs"/>
-          <w:u w:color="EE0000"/>
-          <w:rtl/>
-        </w:rPr>
-        <w:t xml:space="preserve"> </w:t>
-      </w:r>
-      <w:proofErr w:type="spellStart"/>
-      <w:r>
-        <w:rPr>
-          <w:rFonts w:ascii="Arial Unicode MS" w:hAnsi="Arial Unicode MS" w:cs="Mj_Casablanca Light" w:hint="cs"/>
-          <w:u w:color="EE0000"/>
-          <w:rtl/>
-        </w:rPr>
-        <w:t>بندی</w:t>
-      </w:r>
-      <w:proofErr w:type="spellEnd"/>
-      <w:r>
-        <w:rPr>
-          <w:rFonts w:ascii="Arial Unicode MS" w:hAnsi="Arial Unicode MS" w:cs="Mj_Casablanca Light" w:hint="cs"/>
-          <w:u w:color="EE0000"/>
-          <w:rtl/>
-        </w:rPr>
-        <w:t xml:space="preserve"> در </w:t>
-      </w:r>
-      <w:proofErr w:type="spellStart"/>
-      <w:r>
-        <w:rPr>
-          <w:rFonts w:ascii="Arial Unicode MS" w:hAnsi="Arial Unicode MS" w:cs="Mj_Casablanca Light" w:hint="cs"/>
-          <w:u w:color="EE0000"/>
-          <w:rtl/>
-        </w:rPr>
-        <w:t>زیر</w:t>
-      </w:r>
-      <w:proofErr w:type="spellEnd"/>
-      <w:r>
-        <w:rPr>
-          <w:rFonts w:ascii="Arial Unicode MS" w:hAnsi="Arial Unicode MS" w:cs="Mj_Casablanca Light" w:hint="cs"/>
-          <w:u w:color="EE0000"/>
-          <w:rtl/>
-        </w:rPr>
-        <w:t xml:space="preserve"> </w:t>
-      </w:r>
-      <w:proofErr w:type="spellStart"/>
-      <w:r>
-        <w:rPr>
-          <w:rFonts w:ascii="Arial Unicode MS" w:hAnsi="Arial Unicode MS" w:cs="Mj_Casablanca Light" w:hint="cs"/>
-          <w:u w:color="EE0000"/>
-          <w:rtl/>
-        </w:rPr>
-        <w:t>آورده</w:t>
-      </w:r>
-      <w:proofErr w:type="spellEnd"/>
-      <w:r>
-        <w:rPr>
-          <w:rFonts w:ascii="Arial Unicode MS" w:hAnsi="Arial Unicode MS" w:cs="Mj_Casablanca Light" w:hint="cs"/>
-          <w:u w:color="EE0000"/>
-          <w:rtl/>
-        </w:rPr>
-        <w:t xml:space="preserve"> شده است</w:t>
+        <w:t>ترتیب اولویت بندی در زیر آورده شده است</w:t>
       </w:r>
       <w:r>
         <w:rPr>
@@ -1834,21 +1493,8 @@
           <w:u w:color="EE0000"/>
           <w:lang w:val="fr-FR"/>
         </w:rPr>
-        <w:t xml:space="preserve">PERT </w:t>
+        <w:t>PERT calculation</w:t>
       </w:r>
-      <w:proofErr w:type="spellStart"/>
-      <w:r>
-        <w:rPr>
-          <w:rFonts w:ascii="Chalkboard SE Bold" w:hAnsi="Chalkboard SE Bold"/>
-          <w:color w:val="4472C4"/>
-          <w:sz w:val="28"/>
-          <w:szCs w:val="28"/>
-          <w:u w:color="EE0000"/>
-          <w:lang w:val="fr-FR"/>
-        </w:rPr>
-        <w:t>calculation</w:t>
-      </w:r>
-      <w:proofErr w:type="spellEnd"/>
     </w:p>
     <w:p>
       <w:pPr>
@@ -1890,7 +1536,6 @@
           <w:lang w:val="it-IT"/>
         </w:rPr>
       </w:pPr>
-      <w:proofErr w:type="spellStart"/>
       <w:r>
         <w:rPr>
           <w:rFonts w:ascii="Chalkboard SE Regular" w:hAnsi="Chalkboard SE Regular"/>
@@ -1900,19 +1545,7 @@
           <w:u w:color="EE0000"/>
           <w:lang w:val="it-IT"/>
         </w:rPr>
-        <w:t>Pessimistic</w:t>
-      </w:r>
-      <w:proofErr w:type="spellEnd"/>
-      <w:r>
-        <w:rPr>
-          <w:rFonts w:ascii="Chalkboard SE Regular" w:hAnsi="Chalkboard SE Regular"/>
-          <w:color w:val="4472C4"/>
-          <w:sz w:val="28"/>
-          <w:szCs w:val="28"/>
-          <w:u w:color="EE0000"/>
-          <w:lang w:val="it-IT"/>
-        </w:rPr>
-        <w:t xml:space="preserve"> estimate</w:t>
+        <w:t>Pessimistic estimate</w:t>
       </w:r>
       <w:r>
         <w:rPr>
@@ -2347,7 +1980,7 @@
   <w:num w:numId="3" w16cid:durableId="1360930868">
     <w:abstractNumId w:val="0"/>
     <w:lvlOverride w:ilvl="0">
-      <w:lvl w:ilvl="0" w:tplc="885A7FF2">
+      <w:lvl w:ilvl="0" w:tplc="E38C2DAA">
         <w:start w:val="1"/>
         <w:numFmt w:val="bullet"/>
         <w:lvlText w:val="·"/>
@@ -2379,7 +2012,7 @@
       </w:lvl>
     </w:lvlOverride>
     <w:lvlOverride w:ilvl="1">
-      <w:lvl w:ilvl="1" w:tplc="F5206F9C">
+      <w:lvl w:ilvl="1" w:tplc="2C6E04AE">
         <w:start w:val="1"/>
         <w:numFmt w:val="bullet"/>
         <w:lvlText w:val="o"/>
@@ -2411,7 +2044,7 @@
       </w:lvl>
     </w:lvlOverride>
     <w:lvlOverride w:ilvl="2">
-      <w:lvl w:ilvl="2" w:tplc="4AAE8A2A">
+      <w:lvl w:ilvl="2" w:tplc="F398B03A">
         <w:start w:val="1"/>
         <w:numFmt w:val="bullet"/>
         <w:lvlText w:val="▪"/>
@@ -2443,7 +2076,7 @@
       </w:lvl>
     </w:lvlOverride>
     <w:lvlOverride w:ilvl="3">
-      <w:lvl w:ilvl="3" w:tplc="DB9A324E">
+      <w:lvl w:ilvl="3" w:tplc="34C27B3E">
         <w:start w:val="1"/>
         <w:numFmt w:val="bullet"/>
         <w:lvlText w:val="·"/>
@@ -2475,7 +2108,7 @@
       </w:lvl>
     </w:lvlOverride>
     <w:lvlOverride w:ilvl="4">
-      <w:lvl w:ilvl="4" w:tplc="30405280">
+      <w:lvl w:ilvl="4" w:tplc="6122B7BC">
         <w:start w:val="1"/>
         <w:numFmt w:val="bullet"/>
         <w:lvlText w:val="o"/>
@@ -2507,7 +2140,7 @@
       </w:lvl>
     </w:lvlOverride>
     <w:lvlOverride w:ilvl="5">
-      <w:lvl w:ilvl="5" w:tplc="726C3E06">
+      <w:lvl w:ilvl="5" w:tplc="3C18BABE">
         <w:start w:val="1"/>
         <w:numFmt w:val="bullet"/>
         <w:lvlText w:val="▪"/>
@@ -2539,7 +2172,7 @@
       </w:lvl>
     </w:lvlOverride>
     <w:lvlOverride w:ilvl="6">
-      <w:lvl w:ilvl="6" w:tplc="C936AF92">
+      <w:lvl w:ilvl="6" w:tplc="95EE479E">
         <w:start w:val="1"/>
         <w:numFmt w:val="bullet"/>
         <w:lvlText w:val="·"/>
@@ -2571,7 +2204,7 @@
       </w:lvl>
     </w:lvlOverride>
     <w:lvlOverride w:ilvl="7">
-      <w:lvl w:ilvl="7" w:tplc="14BA9D9E">
+      <w:lvl w:ilvl="7" w:tplc="037CE7FA">
         <w:start w:val="1"/>
         <w:numFmt w:val="bullet"/>
         <w:lvlText w:val="o"/>
@@ -2603,7 +2236,7 @@
       </w:lvl>
     </w:lvlOverride>
     <w:lvlOverride w:ilvl="8">
-      <w:lvl w:ilvl="8" w:tplc="65BA0278">
+      <w:lvl w:ilvl="8" w:tplc="13062022">
         <w:start w:val="1"/>
         <w:numFmt w:val="bullet"/>
         <w:lvlText w:val="▪"/>

</xml_diff>